<commit_message>
edits to modern history
</commit_message>
<xml_diff>
--- a/chapters/extras/The Modern Histories - Ebbing South.docx
+++ b/chapters/extras/The Modern Histories - Ebbing South.docx
@@ -2136,7 +2136,31 @@
           <w:szCs w:val="28"/>
           <w:rtl w:val="0"/>
         </w:rPr>
-        <w:t xml:space="preserve">The black, she had not seen it for so long, so forbidden as it was to even plant a kiss on the edge of Realm, to dream of it. She had seen men and women alike burned alive, their skin slowly fried by the continual pouring of ladlefuls of burning-hot pork fat, strapped down on their bellies, their hair sizzling away as their screams filled the air. This was the cost of visiting their second home, and she had never dreamed she would risk paying it. Yet, here she was, staring around at a thousand neon stars dancing in the distance. Her tears, floating up to form bubbles and pop into a flicker of sparks, like petals blown in the breeze.</w:t>
+        <w:t xml:space="preserve">The black, she had not seen it for so long, so forbidden as it was to even plant a kiss on the edge of Realm, to dream of it. She had seen men and women alike fried alive, their skin bubbled to blister by the continual pouring of ladlefuls of burning-hot pork fat, strapped down on their bellies, their hair sizzling away as their screams filled the air. </w:t>
+      </w:r>
+    </w:p>
+    <w:p>
+      <w:pPr>
+        <w:rPr>
+          <w:rFonts w:ascii="Montserrat" w:cs="Montserrat" w:eastAsia="Montserrat" w:hAnsi="Montserrat"/>
+          <w:i w:val="1"/>
+          <w:iCs w:val="1"/>
+          <w:color w:val="ffffff"/>
+          <w:sz w:val="28"/>
+          <w:szCs w:val="28"/>
+        </w:rPr>
+      </w:pPr>
+      <w:r>
+        <w:rPr>
+          <w:rFonts w:ascii="Montserrat" w:cs="Montserrat" w:eastAsia="Montserrat" w:hAnsi="Montserrat"/>
+          <w:i w:val="1"/>
+          <w:iCs w:val="1"/>
+          <w:color w:val="ffffff"/>
+          <w:sz w:val="28"/>
+          <w:szCs w:val="28"/>
+          <w:rtl w:val="0"/>
+        </w:rPr>
+        <w:t xml:space="preserve">This was the cost of visiting their second home, and she had never dreamed she would risk paying it. Yet, here she was, staring around at a thousand neon stars dancing in the distance. Her tears, floating up to form bubbles and pop into a flicker of sparks, like petals blown in the breeze.</w:t>
       </w:r>
     </w:p>
     <w:p>

</xml_diff>

<commit_message>
edited mh added a bit
</commit_message>
<xml_diff>
--- a/chapters/extras/The Modern Histories - Ebbing South.docx
+++ b/chapters/extras/The Modern Histories - Ebbing South.docx
@@ -239,7 +239,7 @@
           <w:szCs w:val="28"/>
           <w:rtl w:val="0"/>
         </w:rPr>
-        <w:t xml:space="preserve">This was the first she had seen of him since they arrived together in the late summer. They had been captured together, brought here together, trialled for robbery together, and convicted together. After only a day, they were then separated that Li'an could be assigned to do laundry and cookery, and Balo was dragged down the shafts. Now he was hanging there, his eyes blackened, his chest bare and caked in his own dried blood, lashed from him with a thin cane over a hundred strikes.</w:t>
+        <w:t xml:space="preserve">This was the first she had seen of him since they arrived together in the late summer. They had been captured together, brought here together, trialled for robbery together, and convicted together. After only a day, they were then separated so that Li'an could be assigned to do laundry and cookery, and Balo was dragged down the shafts. Now he was hanging there, his eyes blackened, his chest bare and caked in his own dried blood, lashed from him with a thin cane over a hundred strikes.</w:t>
       </w:r>
     </w:p>
     <w:p>
@@ -753,32 +753,80 @@
           <w:szCs w:val="28"/>
           <w:rtl w:val="0"/>
         </w:rPr>
-        <w:t xml:space="preserve">“I do desire you, Li’an, I have since the day I first saw you here,” he said. “You are a creature of such innocent beauty, it’s hard to even describe. Everything about you is so graceful, you’re not alike anyone.”</w:t>
-      </w:r>
-    </w:p>
-    <w:p>
-      <w:pPr>
-        <w:ind w:left="0" w:firstLine="720"/>
-        <w:rPr>
-          <w:rFonts w:ascii="Montserrat" w:cs="Montserrat" w:eastAsia="Montserrat" w:hAnsi="Montserrat"/>
-          <w:i w:val="1"/>
-          <w:iCs w:val="1"/>
-          <w:color w:val="ffffff"/>
-          <w:sz w:val="28"/>
-          <w:szCs w:val="28"/>
-        </w:rPr>
-      </w:pPr>
-      <w:r>
-        <w:rPr>
-          <w:rFonts w:ascii="Montserrat" w:cs="Montserrat" w:eastAsia="Montserrat" w:hAnsi="Montserrat"/>
-          <w:i w:val="1"/>
-          <w:iCs w:val="1"/>
-          <w:color w:val="ffffff"/>
-          <w:sz w:val="28"/>
-          <w:szCs w:val="28"/>
-          <w:rtl w:val="0"/>
-        </w:rPr>
-        <w:t xml:space="preserve">“I know,” she whispered, looking down at his shins as she spoke. “The other women, the guards just take what they want from them, but never from me... I always knew it was your protection.”</w:t>
+        <w:t xml:space="preserve">“I do desire you, Li’an, I have since the day I first saw you here,” he said. “You are a creature of such innocent beauty, it’s hard to even describe. Everything about you is so graceful, you’re not </w:t>
+      </w:r>
+      <w:r>
+        <w:rPr>
+          <w:rFonts w:ascii="Montserrat" w:cs="Montserrat" w:eastAsia="Montserrat" w:hAnsi="Montserrat"/>
+          <w:i w:val="1"/>
+          <w:iCs w:val="1"/>
+          <w:color w:val="ffffff"/>
+          <w:sz w:val="28"/>
+          <w:szCs w:val="28"/>
+          <w:rtl w:val="0"/>
+        </w:rPr>
+        <w:t xml:space="preserve">alike</w:t>
+      </w:r>
+      <w:r>
+        <w:rPr>
+          <w:rFonts w:ascii="Montserrat" w:cs="Montserrat" w:eastAsia="Montserrat" w:hAnsi="Montserrat"/>
+          <w:i w:val="1"/>
+          <w:iCs w:val="1"/>
+          <w:color w:val="ffffff"/>
+          <w:sz w:val="28"/>
+          <w:szCs w:val="28"/>
+          <w:rtl w:val="0"/>
+        </w:rPr>
+        <w:t xml:space="preserve"> anyone.”</w:t>
+      </w:r>
+    </w:p>
+    <w:p>
+      <w:pPr>
+        <w:ind w:left="0" w:firstLine="720"/>
+        <w:rPr>
+          <w:rFonts w:ascii="Montserrat" w:cs="Montserrat" w:eastAsia="Montserrat" w:hAnsi="Montserrat"/>
+          <w:i w:val="1"/>
+          <w:iCs w:val="1"/>
+          <w:color w:val="ffffff"/>
+          <w:sz w:val="28"/>
+          <w:szCs w:val="28"/>
+        </w:rPr>
+      </w:pPr>
+      <w:r>
+        <w:rPr>
+          <w:rFonts w:ascii="Montserrat" w:cs="Montserrat" w:eastAsia="Montserrat" w:hAnsi="Montserrat"/>
+          <w:i w:val="1"/>
+          <w:iCs w:val="1"/>
+          <w:color w:val="ffffff"/>
+          <w:sz w:val="28"/>
+          <w:szCs w:val="28"/>
+          <w:rtl w:val="0"/>
+        </w:rPr>
+        <w:t xml:space="preserve">“I know,” she whispered, looking down at his shins as she spoke. “The other women, the </w:t>
+      </w:r>
+      <w:r>
+        <w:rPr>
+          <w:rFonts w:ascii="Montserrat" w:cs="Montserrat" w:eastAsia="Montserrat" w:hAnsi="Montserrat"/>
+          <w:i w:val="1"/>
+          <w:iCs w:val="1"/>
+          <w:color w:val="ffffff"/>
+          <w:sz w:val="28"/>
+          <w:szCs w:val="28"/>
+          <w:rtl w:val="0"/>
+        </w:rPr>
+        <w:t xml:space="preserve">guards just</w:t>
+      </w:r>
+      <w:r>
+        <w:rPr>
+          <w:rFonts w:ascii="Montserrat" w:cs="Montserrat" w:eastAsia="Montserrat" w:hAnsi="Montserrat"/>
+          <w:i w:val="1"/>
+          <w:iCs w:val="1"/>
+          <w:color w:val="ffffff"/>
+          <w:sz w:val="28"/>
+          <w:szCs w:val="28"/>
+          <w:rtl w:val="0"/>
+        </w:rPr>
+        <w:t xml:space="preserve"> take what they want from them, but never from me... I always knew it was your protection.”</w:t>
       </w:r>
     </w:p>
     <w:p>
@@ -907,7 +955,19 @@
           <w:szCs w:val="28"/>
           <w:rtl w:val="0"/>
         </w:rPr>
-        <w:t xml:space="preserve">Of a sudden, he withdrew against her pull and departed her embrace. He held her open lips back, his hand still resting on the side of her head.</w:t>
+        <w:t xml:space="preserve">Of a sudden</w:t>
+      </w:r>
+      <w:r>
+        <w:rPr>
+          <w:rFonts w:ascii="Montserrat" w:cs="Montserrat" w:eastAsia="Montserrat" w:hAnsi="Montserrat"/>
+          <w:i w:val="1"/>
+          <w:iCs w:val="1"/>
+          <w:color w:val="ffffff"/>
+          <w:sz w:val="28"/>
+          <w:szCs w:val="28"/>
+          <w:rtl w:val="0"/>
+        </w:rPr>
+        <w:t xml:space="preserve">, he withdrew against her pull and departed her embrace. He held her open lips back, his hand still resting on the side of her head.</w:t>
       </w:r>
     </w:p>
     <w:p>
@@ -1251,7 +1311,7 @@
           <w:szCs w:val="28"/>
           <w:rtl w:val="0"/>
         </w:rPr>
-        <w:t xml:space="preserve">“Listen, you can tell me anything you want to, I can exclude anything you change your mind about, it’s entirely your choice…” said Pristenne, somewhat regretting having disturbed the waters. “But it’s just a little, unusual, I suppose, to describe these events with such </w:t>
+        <w:t xml:space="preserve">“Listen, you can tell me anything you want to, I can exclude anything you change your mind about, it’s entirely your choice…” said Pristenne, somewhat regretting having disturbed the waters. “But it’s just a little… unusual, I suppose, to describe these events with such </w:t>
       </w:r>
       <w:r>
         <w:rPr>
@@ -1510,7 +1570,7 @@
           <w:szCs w:val="28"/>
           <w:rtl w:val="0"/>
         </w:rPr>
-        <w:t xml:space="preserve">“Seems this site is too short on men to throw away good labour,” said Sitemaster Hartford, his voice so rough for a man of his young age, so darkened by tobacco smoke and spite. “So you little shitheads get to go back to work.” He thrust the tip of his boot into the ribs of the closest to him, then knelt down to grab the back of Balo’s head and spit some words into his ear. Then, he threw the head forward, and stood to stare into the crowd once again. “But mark my words, any more shit from any of you, and you’ll be fried alive.”</w:t>
+        <w:t xml:space="preserve">“Seems this site is too short on men to throw away good labour,” said Sitemaster Hartford, his voice so rough for a man of his young age, so darkened by tobacco smoke and spite. “So you little shitheads get to go back to work.” He thrust the tip of his boot into the ribs of the man closest to him, then knelt down to grab the back of Balo’s head and spit some words into his ear. Then, he threw the head forward, and stood to stare into the crowd once again. “But mark my words, any more shit from any of you, and you’ll be fried alive.”</w:t>
       </w:r>
     </w:p>
     <w:p>
@@ -1590,7 +1650,49 @@
           <w:szCs w:val="28"/>
           <w:rtl w:val="0"/>
         </w:rPr>
-        <w:t xml:space="preserve">“So he really did free them, </w:t>
+        <w:t xml:space="preserve">“What do you expect he whispered to Balo?” asked Verity.</w:t>
+      </w:r>
+    </w:p>
+    <w:p>
+      <w:pPr>
+        <w:ind w:left="0" w:firstLine="720"/>
+        <w:rPr>
+          <w:rFonts w:ascii="Montserrat" w:cs="Montserrat" w:eastAsia="Montserrat" w:hAnsi="Montserrat"/>
+          <w:color w:val="ffffff"/>
+          <w:sz w:val="28"/>
+          <w:szCs w:val="28"/>
+        </w:rPr>
+      </w:pPr>
+      <w:r>
+        <w:rPr>
+          <w:rFonts w:ascii="Montserrat" w:cs="Montserrat" w:eastAsia="Montserrat" w:hAnsi="Montserrat"/>
+          <w:color w:val="ffffff"/>
+          <w:sz w:val="28"/>
+          <w:szCs w:val="28"/>
+          <w:rtl w:val="0"/>
+        </w:rPr>
+        <w:t xml:space="preserve">“Oh, some crude thing, no doubt, something to torment his mind while he was down in the darkness, something about infidelity,” she said. “It would have had no effect, we don’t allow such things power over us.” </w:t>
+      </w:r>
+    </w:p>
+    <w:p>
+      <w:pPr>
+        <w:ind w:left="0" w:firstLine="720"/>
+        <w:rPr>
+          <w:rFonts w:ascii="Montserrat" w:cs="Montserrat" w:eastAsia="Montserrat" w:hAnsi="Montserrat"/>
+          <w:color w:val="ffffff"/>
+          <w:sz w:val="28"/>
+          <w:szCs w:val="28"/>
+        </w:rPr>
+      </w:pPr>
+      <w:r>
+        <w:rPr>
+          <w:rFonts w:ascii="Montserrat" w:cs="Montserrat" w:eastAsia="Montserrat" w:hAnsi="Montserrat"/>
+          <w:color w:val="ffffff"/>
+          <w:sz w:val="28"/>
+          <w:szCs w:val="28"/>
+          <w:rtl w:val="0"/>
+        </w:rPr>
+        <w:t xml:space="preserve">“And, Derrian really did free them, </w:t>
       </w:r>
       <w:r>
         <w:rPr>
@@ -1633,7 +1735,27 @@
           <w:szCs w:val="28"/>
           <w:rtl w:val="0"/>
         </w:rPr>
-        <w:t xml:space="preserve">“He did,” said Li’an. “And I gave it to him most gladly. I owed him for all those lives. He didn’t just save them, he ensured they were treated with better care, even let me see Balo in the public yard, to see him in good health. I would have done anything for that.”</w:t>
+        <w:t xml:space="preserve">“He did,” said Li’an. “And I gave it to him most gladly. I </w:t>
+      </w:r>
+      <w:r>
+        <w:rPr>
+          <w:rFonts w:ascii="Montserrat" w:cs="Montserrat" w:eastAsia="Montserrat" w:hAnsi="Montserrat"/>
+          <w:color w:val="ffffff"/>
+          <w:sz w:val="28"/>
+          <w:szCs w:val="28"/>
+          <w:rtl w:val="0"/>
+        </w:rPr>
+        <w:t xml:space="preserve">owed</w:t>
+      </w:r>
+      <w:r>
+        <w:rPr>
+          <w:rFonts w:ascii="Montserrat" w:cs="Montserrat" w:eastAsia="Montserrat" w:hAnsi="Montserrat"/>
+          <w:color w:val="ffffff"/>
+          <w:sz w:val="28"/>
+          <w:szCs w:val="28"/>
+          <w:rtl w:val="0"/>
+        </w:rPr>
+        <w:t xml:space="preserve"> him for all those lives. He didn’t just save them, he ensured they were treated with better care, even let me see Balo in the public yard, to see him in good health. I would have done anything for that.”</w:t>
       </w:r>
     </w:p>
     <w:p>
@@ -2907,7 +3029,79 @@
           <w:szCs w:val="28"/>
           <w:rtl w:val="0"/>
         </w:rPr>
-        <w:t xml:space="preserve">“People of Yantai, we are here to bring to you three gifts!” Mekhis, a young woman with a long, black braid dancing behind her back with her every animated word, and black holes that pierced into all she looked at. “The first, is freedom! Freedom from slavery! Freedom from violation! Freedom from fucking Anoleth!” There were so few men remaining, but as weak as they had become, their voices of cheer rose up into the morning. “The second, is an invitation to join us, the scourge of these daemons, the terrorists, the militia that have become the object of their greatest fears! I will train you to fight, train you to fly, and you will embody the nightmares of these subhuman creatures you were once so afraid of!” Li’an stayed quiet and still, standing on the step at the front of the dormitories, staining her dress on the charred pillar, watching as the crowd delighted at the words of this woman standing on the stage where she had heard so many spiteful words already. “And the third thing we bring to you, my people of Yantai, is the greatest gift of all, one that you will need if you are to understand just how pathetic these slavers really are.” As she spoke, two of her militiamen carried out that large and most familiar pail, towels wrapped around the handles that their hands might not be burned by them. “Catharsis!”</w:t>
+        <w:t xml:space="preserve">“People of Yantai, we are here to bring to you three gifts!” Mekhis, a young woman with a long, black braid, tied beneath a neat bow of hair, dancing behind her back with her every animated word, and black holes that pierced into all she looked at, spoke with such conviction. “</w:t>
+      </w:r>
+      <w:r>
+        <w:rPr>
+          <w:rFonts w:ascii="Montserrat" w:cs="Montserrat" w:eastAsia="Montserrat" w:hAnsi="Montserrat"/>
+          <w:i w:val="1"/>
+          <w:iCs w:val="1"/>
+          <w:color w:val="ffffff"/>
+          <w:sz w:val="28"/>
+          <w:szCs w:val="28"/>
+          <w:rtl w:val="0"/>
+        </w:rPr>
+        <w:t xml:space="preserve">The first</w:t>
+      </w:r>
+      <w:r>
+        <w:rPr>
+          <w:rFonts w:ascii="Montserrat" w:cs="Montserrat" w:eastAsia="Montserrat" w:hAnsi="Montserrat"/>
+          <w:i w:val="1"/>
+          <w:iCs w:val="1"/>
+          <w:color w:val="ffffff"/>
+          <w:sz w:val="28"/>
+          <w:szCs w:val="28"/>
+          <w:rtl w:val="0"/>
+        </w:rPr>
+        <w:t xml:space="preserve">… </w:t>
+      </w:r>
+      <w:r>
+        <w:rPr>
+          <w:rFonts w:ascii="Montserrat" w:cs="Montserrat" w:eastAsia="Montserrat" w:hAnsi="Montserrat"/>
+          <w:i w:val="1"/>
+          <w:iCs w:val="1"/>
+          <w:color w:val="ffffff"/>
+          <w:sz w:val="28"/>
+          <w:szCs w:val="28"/>
+          <w:rtl w:val="0"/>
+        </w:rPr>
+        <w:t xml:space="preserve">is freedom</w:t>
+      </w:r>
+      <w:r>
+        <w:rPr>
+          <w:rFonts w:ascii="Montserrat" w:cs="Montserrat" w:eastAsia="Montserrat" w:hAnsi="Montserrat"/>
+          <w:i w:val="1"/>
+          <w:iCs w:val="1"/>
+          <w:color w:val="ffffff"/>
+          <w:sz w:val="28"/>
+          <w:szCs w:val="28"/>
+          <w:rtl w:val="0"/>
+        </w:rPr>
+        <w:t xml:space="preserve">! Freedom from slavery! Freedom from violation! Freedom from fucking Anoleth!” There were so few men remaining, but as weak as they had become, their voices of cheer rose up into the morning. “The second, is an invitation to join us, the scourge of these daemons, the terrorists, the militia that have become the object of their greatest fears! I will train you to fight, train you to fly, and you will embody the nightmares of these subhuman creatures you were once so afraid of!” Li’an stayed quiet and still, standing on the step at the front of the dormitories, staining her dress on the charred pillar, watching as the crowd delighted at the words of this woman standing on the stage where she had heard so many spiteful words already. “And the third thing we bring to you, my people of Yantai, is the greatest gift of all, one that you will need if you are to understand just how pathetic these slavers really are.” As she spoke, two of her militiamen carried out that large and most familiar pail, towels wrapped around the </w:t>
+      </w:r>
+      <w:r>
+        <w:rPr>
+          <w:rFonts w:ascii="Montserrat" w:cs="Montserrat" w:eastAsia="Montserrat" w:hAnsi="Montserrat"/>
+          <w:i w:val="1"/>
+          <w:iCs w:val="1"/>
+          <w:color w:val="ffffff"/>
+          <w:sz w:val="28"/>
+          <w:szCs w:val="28"/>
+          <w:rtl w:val="0"/>
+        </w:rPr>
+        <w:t xml:space="preserve">handles that</w:t>
+      </w:r>
+      <w:r>
+        <w:rPr>
+          <w:rFonts w:ascii="Montserrat" w:cs="Montserrat" w:eastAsia="Montserrat" w:hAnsi="Montserrat"/>
+          <w:i w:val="1"/>
+          <w:iCs w:val="1"/>
+          <w:color w:val="ffffff"/>
+          <w:sz w:val="28"/>
+          <w:szCs w:val="28"/>
+          <w:rtl w:val="0"/>
+        </w:rPr>
+        <w:t xml:space="preserve"> their hands might not be burned by them. “Catharsis!”</w:t>
         <w:br w:type="textWrapping"/>
         <w:t xml:space="preserve">The hot fat sloshed over the edge and a burst of steam rose up from the puddle it landed into, a murmur of horror beginning to rise from the line of naked guardsmen kneeling on the floor, looking up at the bubbling pot. Their eyes were so full of fear. </w:t>
         <w:br w:type="textWrapping"/>
@@ -2965,7 +3159,31 @@
           <w:szCs w:val="28"/>
           <w:rtl w:val="0"/>
         </w:rPr>
-        <w:t xml:space="preserve">“Take this gift however you should choose to. These criminals exist now only to suffer, as you have, to raise you from their cruelty that you might know their strength.”</w:t>
+        <w:t xml:space="preserve">“Take this gift however you choose to. These criminals exist now only to suffer, as you have, to raise you from their </w:t>
+      </w:r>
+      <w:r>
+        <w:rPr>
+          <w:rFonts w:ascii="Montserrat" w:cs="Montserrat" w:eastAsia="Montserrat" w:hAnsi="Montserrat"/>
+          <w:i w:val="1"/>
+          <w:iCs w:val="1"/>
+          <w:color w:val="ffffff"/>
+          <w:sz w:val="28"/>
+          <w:szCs w:val="28"/>
+          <w:rtl w:val="0"/>
+        </w:rPr>
+        <w:t xml:space="preserve">cruelty that</w:t>
+      </w:r>
+      <w:r>
+        <w:rPr>
+          <w:rFonts w:ascii="Montserrat" w:cs="Montserrat" w:eastAsia="Montserrat" w:hAnsi="Montserrat"/>
+          <w:i w:val="1"/>
+          <w:iCs w:val="1"/>
+          <w:color w:val="ffffff"/>
+          <w:sz w:val="28"/>
+          <w:szCs w:val="28"/>
+          <w:rtl w:val="0"/>
+        </w:rPr>
+        <w:t xml:space="preserve"> you might know their strength.”</w:t>
       </w:r>
     </w:p>
     <w:p>
@@ -3042,7 +3260,31 @@
           <w:szCs w:val="28"/>
           <w:rtl w:val="0"/>
         </w:rPr>
-        <w:t xml:space="preserve">“It does matter,” she replied, a desperate tone seeping in. “He doesn’t deserve to be tortured, by Gods…”</w:t>
+        <w:t xml:space="preserve">“It does matter,” she replied, a desperate tone seeping in. “He doesn’t deserve to be </w:t>
+      </w:r>
+      <w:r>
+        <w:rPr>
+          <w:rFonts w:ascii="Montserrat" w:cs="Montserrat" w:eastAsia="Montserrat" w:hAnsi="Montserrat"/>
+          <w:i w:val="1"/>
+          <w:iCs w:val="1"/>
+          <w:color w:val="ffffff"/>
+          <w:sz w:val="28"/>
+          <w:szCs w:val="28"/>
+          <w:rtl w:val="0"/>
+        </w:rPr>
+        <w:t xml:space="preserve">tortured, by</w:t>
+      </w:r>
+      <w:r>
+        <w:rPr>
+          <w:rFonts w:ascii="Montserrat" w:cs="Montserrat" w:eastAsia="Montserrat" w:hAnsi="Montserrat"/>
+          <w:i w:val="1"/>
+          <w:iCs w:val="1"/>
+          <w:color w:val="ffffff"/>
+          <w:sz w:val="28"/>
+          <w:szCs w:val="28"/>
+          <w:rtl w:val="0"/>
+        </w:rPr>
+        <w:t xml:space="preserve"> Gods…”</w:t>
       </w:r>
     </w:p>
     <w:p>
@@ -5147,28 +5389,220 @@
           <w:szCs w:val="28"/>
           <w:rtl w:val="0"/>
         </w:rPr>
-        <w:t xml:space="preserve">“Never,” she replied. “I was given a house in Astrum, an honorary citizenship, but it was all very political, all to appease Menastis and the fragile peace. I stayed in the city because it was expected of me, started the support network for former Yantai slave women, and… here we are today.” She leaned forward, pulling the numbing base of her spine to the edge of her armchair. “You know, I always thought that King Lor’End might have still suspected me a spy all those years, and all the wealth was just trying to keep me close, under the Crown’s eye.”</w:t>
-      </w:r>
-    </w:p>
-    <w:p>
-      <w:pPr>
-        <w:ind w:left="0" w:firstLine="720"/>
-        <w:rPr>
-          <w:rFonts w:ascii="Montserrat" w:cs="Montserrat" w:eastAsia="Montserrat" w:hAnsi="Montserrat"/>
-          <w:color w:val="ffffff"/>
-          <w:sz w:val="28"/>
-          <w:szCs w:val="28"/>
-        </w:rPr>
-      </w:pPr>
-      <w:r>
-        <w:rPr>
-          <w:rFonts w:ascii="Montserrat" w:cs="Montserrat" w:eastAsia="Montserrat" w:hAnsi="Montserrat"/>
-          <w:color w:val="ffffff"/>
-          <w:sz w:val="28"/>
-          <w:szCs w:val="28"/>
-          <w:rtl w:val="0"/>
-        </w:rPr>
-        <w:t xml:space="preserve">“Well,” said Pristenne, placing a final jot then closing her journal, wrapping the orange binding with its ribbon and sliding in the pen at its edge. “Are you? The greatest spy of all time?”</w:t>
+        <w:t xml:space="preserve">“Never,” she replied. “I was given a house in Astrum, an honorary citizenship, but it was all very political, all to appease Menastis and the fragile peace. I stayed in the city because it was expected of me, used the gifts to start the Healing Heart support network of which you are, of course, a patron, and… here we are today.” </w:t>
+      </w:r>
+    </w:p>
+    <w:p>
+      <w:pPr>
+        <w:ind w:left="0" w:firstLine="720"/>
+        <w:rPr>
+          <w:rFonts w:ascii="Montserrat" w:cs="Montserrat" w:eastAsia="Montserrat" w:hAnsi="Montserrat"/>
+          <w:color w:val="ffffff"/>
+          <w:sz w:val="28"/>
+          <w:szCs w:val="28"/>
+        </w:rPr>
+      </w:pPr>
+      <w:r>
+        <w:rPr>
+          <w:rFonts w:ascii="Montserrat" w:cs="Montserrat" w:eastAsia="Montserrat" w:hAnsi="Montserrat"/>
+          <w:color w:val="ffffff"/>
+          <w:sz w:val="28"/>
+          <w:szCs w:val="28"/>
+          <w:rtl w:val="0"/>
+        </w:rPr>
+        <w:t xml:space="preserve">“You’ll always have my support, and that of the Star, the work you do is so important, and underestimated in my view,” said Verity, and as she did, she saw Li’an’s assistant step forward to whisper into her ear, and prepared her final questions. “It’s been a very long time now, but do you ever miss your husband, Balo?”</w:t>
+      </w:r>
+    </w:p>
+    <w:p>
+      <w:pPr>
+        <w:ind w:left="0" w:firstLine="720"/>
+        <w:rPr>
+          <w:rFonts w:ascii="Montserrat" w:cs="Montserrat" w:eastAsia="Montserrat" w:hAnsi="Montserrat"/>
+          <w:color w:val="ffffff"/>
+          <w:sz w:val="28"/>
+          <w:szCs w:val="28"/>
+        </w:rPr>
+      </w:pPr>
+      <w:r>
+        <w:rPr>
+          <w:rFonts w:ascii="Montserrat" w:cs="Montserrat" w:eastAsia="Montserrat" w:hAnsi="Montserrat"/>
+          <w:color w:val="ffffff"/>
+          <w:sz w:val="28"/>
+          <w:szCs w:val="28"/>
+          <w:rtl w:val="0"/>
+        </w:rPr>
+        <w:t xml:space="preserve">She leaned forward, pulling the numbing base of her spine to the edge of her armchair. </w:t>
+      </w:r>
+    </w:p>
+    <w:p>
+      <w:pPr>
+        <w:ind w:left="0" w:firstLine="720"/>
+        <w:rPr>
+          <w:rFonts w:ascii="Montserrat" w:cs="Montserrat" w:eastAsia="Montserrat" w:hAnsi="Montserrat"/>
+          <w:color w:val="ffffff"/>
+          <w:sz w:val="28"/>
+          <w:szCs w:val="28"/>
+        </w:rPr>
+      </w:pPr>
+      <w:r>
+        <w:rPr>
+          <w:rFonts w:ascii="Montserrat" w:cs="Montserrat" w:eastAsia="Montserrat" w:hAnsi="Montserrat"/>
+          <w:color w:val="ffffff"/>
+          <w:sz w:val="28"/>
+          <w:szCs w:val="28"/>
+          <w:rtl w:val="0"/>
+        </w:rPr>
+        <w:t xml:space="preserve">“Every day,” she said. “But I know I’ll see him again, when my life here comes to its end.”</w:t>
+      </w:r>
+    </w:p>
+    <w:p>
+      <w:pPr>
+        <w:ind w:left="0" w:firstLine="720"/>
+        <w:rPr>
+          <w:rFonts w:ascii="Montserrat" w:cs="Montserrat" w:eastAsia="Montserrat" w:hAnsi="Montserrat"/>
+          <w:color w:val="ffffff"/>
+          <w:sz w:val="28"/>
+          <w:szCs w:val="28"/>
+        </w:rPr>
+      </w:pPr>
+      <w:r>
+        <w:rPr>
+          <w:rFonts w:ascii="Montserrat" w:cs="Montserrat" w:eastAsia="Montserrat" w:hAnsi="Montserrat"/>
+          <w:color w:val="ffffff"/>
+          <w:sz w:val="28"/>
+          <w:szCs w:val="28"/>
+          <w:rtl w:val="0"/>
+        </w:rPr>
+        <w:t xml:space="preserve">“How about Derrian?” </w:t>
+      </w:r>
+    </w:p>
+    <w:p>
+      <w:pPr>
+        <w:ind w:left="0" w:firstLine="720"/>
+        <w:rPr>
+          <w:rFonts w:ascii="Montserrat" w:cs="Montserrat" w:eastAsia="Montserrat" w:hAnsi="Montserrat"/>
+          <w:color w:val="ffffff"/>
+          <w:sz w:val="28"/>
+          <w:szCs w:val="28"/>
+        </w:rPr>
+      </w:pPr>
+      <w:r>
+        <w:rPr>
+          <w:rFonts w:ascii="Montserrat" w:cs="Montserrat" w:eastAsia="Montserrat" w:hAnsi="Montserrat"/>
+          <w:color w:val="ffffff"/>
+          <w:sz w:val="28"/>
+          <w:szCs w:val="28"/>
+          <w:rtl w:val="0"/>
+        </w:rPr>
+        <w:t xml:space="preserve">“Hmm…” she looked down at the tiles. “In a different way, of course. And I’ll see </w:t>
+      </w:r>
+      <w:r>
+        <w:rPr>
+          <w:rFonts w:ascii="Montserrat" w:cs="Montserrat" w:eastAsia="Montserrat" w:hAnsi="Montserrat"/>
+          <w:i w:val="1"/>
+          <w:iCs w:val="1"/>
+          <w:color w:val="ffffff"/>
+          <w:sz w:val="28"/>
+          <w:szCs w:val="28"/>
+          <w:rtl w:val="0"/>
+        </w:rPr>
+        <w:t xml:space="preserve">him </w:t>
+      </w:r>
+      <w:r>
+        <w:rPr>
+          <w:rFonts w:ascii="Montserrat" w:cs="Montserrat" w:eastAsia="Montserrat" w:hAnsi="Montserrat"/>
+          <w:color w:val="ffffff"/>
+          <w:sz w:val="28"/>
+          <w:szCs w:val="28"/>
+          <w:rtl w:val="0"/>
+        </w:rPr>
+        <w:t xml:space="preserve">again, too.”</w:t>
+      </w:r>
+    </w:p>
+    <w:p>
+      <w:pPr>
+        <w:ind w:left="0" w:firstLine="0"/>
+        <w:rPr>
+          <w:rFonts w:ascii="Montserrat" w:cs="Montserrat" w:eastAsia="Montserrat" w:hAnsi="Montserrat"/>
+          <w:color w:val="ffffff"/>
+          <w:sz w:val="28"/>
+          <w:szCs w:val="28"/>
+        </w:rPr>
+      </w:pPr>
+      <w:r>
+        <w:rPr>
+          <w:rFonts w:ascii="Montserrat" w:cs="Montserrat" w:eastAsia="Montserrat" w:hAnsi="Montserrat"/>
+          <w:color w:val="ffffff"/>
+          <w:sz w:val="28"/>
+          <w:szCs w:val="28"/>
+          <w:rtl w:val="0"/>
+        </w:rPr>
+        <w:tab/>
+        <w:t xml:space="preserve">“One last question,” said Verity, watching her assistant shuffle away and begin to pack her things on the table at the back of the room. “The wealth you’ve amassed today, does it in any way compensate for everything that happened to you? Will any material amount ever be enough?”</w:t>
+      </w:r>
+    </w:p>
+    <w:p>
+      <w:pPr>
+        <w:ind w:left="0" w:firstLine="720"/>
+        <w:rPr>
+          <w:rFonts w:ascii="Montserrat" w:cs="Montserrat" w:eastAsia="Montserrat" w:hAnsi="Montserrat"/>
+          <w:color w:val="ffffff"/>
+          <w:sz w:val="28"/>
+          <w:szCs w:val="28"/>
+        </w:rPr>
+      </w:pPr>
+      <w:r>
+        <w:rPr>
+          <w:rFonts w:ascii="Montserrat" w:cs="Montserrat" w:eastAsia="Montserrat" w:hAnsi="Montserrat"/>
+          <w:color w:val="ffffff"/>
+          <w:sz w:val="28"/>
+          <w:szCs w:val="28"/>
+          <w:rtl w:val="0"/>
+        </w:rPr>
+        <w:t xml:space="preserve">“You know, I always thought that King Lor’End might have still suspected me a spy all those years, and all the wealth was just trying to keep me close, under the Crown’s eye. He was a wise and cautious king, after all, and it served me well to </w:t>
+      </w:r>
+      <w:r>
+        <w:rPr>
+          <w:rFonts w:ascii="Montserrat" w:cs="Montserrat" w:eastAsia="Montserrat" w:hAnsi="Montserrat"/>
+          <w:i w:val="1"/>
+          <w:iCs w:val="1"/>
+          <w:color w:val="ffffff"/>
+          <w:sz w:val="28"/>
+          <w:szCs w:val="28"/>
+          <w:rtl w:val="0"/>
+        </w:rPr>
+        <w:t xml:space="preserve">never </w:t>
+      </w:r>
+      <w:r>
+        <w:rPr>
+          <w:rFonts w:ascii="Montserrat" w:cs="Montserrat" w:eastAsia="Montserrat" w:hAnsi="Montserrat"/>
+          <w:color w:val="ffffff"/>
+          <w:sz w:val="28"/>
+          <w:szCs w:val="28"/>
+          <w:rtl w:val="0"/>
+        </w:rPr>
+        <w:t xml:space="preserve">ask.”</w:t>
+      </w:r>
+    </w:p>
+    <w:p>
+      <w:pPr>
+        <w:ind w:left="0" w:firstLine="720"/>
+        <w:rPr>
+          <w:rFonts w:ascii="Montserrat" w:cs="Montserrat" w:eastAsia="Montserrat" w:hAnsi="Montserrat"/>
+          <w:color w:val="ffffff"/>
+          <w:sz w:val="28"/>
+          <w:szCs w:val="28"/>
+        </w:rPr>
+      </w:pPr>
+      <w:r>
+        <w:rPr>
+          <w:rFonts w:ascii="Montserrat" w:cs="Montserrat" w:eastAsia="Montserrat" w:hAnsi="Montserrat"/>
+          <w:color w:val="ffffff"/>
+          <w:sz w:val="28"/>
+          <w:szCs w:val="28"/>
+          <w:rtl w:val="0"/>
+        </w:rPr>
+        <w:t xml:space="preserve">“Well,” said Pristenne, placing a final jot then closing her journal, wrapping the orange binding with its ribbon and sliding in the pen at its edge. “Are you? Somehow, the greatest spy of all time?”</w:t>
         <w:br w:type="textWrapping"/>
         <w:t xml:space="preserve">Li’an stood and bowed her head, and Pristenne joined her on her feet with an outstretched hand. Li’an took it and gave it a firm, gentle shake.</w:t>
       </w:r>

</xml_diff>

<commit_message>
fixed up modern history 1
</commit_message>
<xml_diff>
--- a/chapters/extras/The Modern Histories - Ebbing South.docx
+++ b/chapters/extras/The Modern Histories - Ebbing South.docx
@@ -1247,7 +1247,7 @@
           <w:szCs w:val="28"/>
           <w:rtl w:val="0"/>
         </w:rPr>
-        <w:t xml:space="preserve">“Can I just…” said Pristenne. “I don’t mean to interrupt your freeflow, but you really don’t need to go into</w:t>
+        <w:t xml:space="preserve">“Can I just…” said Pristenne. “I don’t mean to interrupt your free-flow, but you really don’t need to go into</w:t>
       </w:r>
       <w:r>
         <w:rPr>
@@ -1776,7 +1776,7 @@
           <w:szCs w:val="28"/>
           <w:rtl w:val="0"/>
         </w:rPr>
-        <w:t xml:space="preserve">“Gods, that’s… I want to slap you, if I’m honest,” laughed Pristenne and Li’an returned a subtle grin to her. “I understand that the Menyantic don’t have much power to fight, but to welcome abuse like that, it’s…”</w:t>
+        <w:t xml:space="preserve">“Gods, that’s… I want to slap you, if I’m honest,” laughed Pristenne, and Li’an returned a subtle grin to her. “I understand that the Menyantic don’t have much power to fight, but to welcome abuse like that, it’s…”</w:t>
       </w:r>
     </w:p>
     <w:p>
@@ -2063,7 +2063,7 @@
           <w:szCs w:val="28"/>
           <w:rtl w:val="0"/>
         </w:rPr>
-        <w:t xml:space="preserve">“There’s nothing…” she said, barely croaking. “I too, should die, that is the only way.”</w:t>
+        <w:t xml:space="preserve">“There’s nothing…” she said, barely croaking. “I too, should die, that is the only way. Then we’ll be together, and free of this cruel machine, the both of us.”</w:t>
       </w:r>
     </w:p>
     <w:p>
@@ -2258,31 +2258,31 @@
           <w:szCs w:val="28"/>
           <w:rtl w:val="0"/>
         </w:rPr>
-        <w:t xml:space="preserve">The black, she had not seen it for so long, so forbidden as it was to even plant a kiss on the edge of Realm, to dream of it. She had seen men and women alike fried alive, their skin bubbled to blister by the continual pouring of ladlefuls of burning-hot pork fat, strapped down on their bellies, their hair sizzling away as their screams filled the air. </w:t>
-      </w:r>
-    </w:p>
-    <w:p>
-      <w:pPr>
-        <w:rPr>
-          <w:rFonts w:ascii="Montserrat" w:cs="Montserrat" w:eastAsia="Montserrat" w:hAnsi="Montserrat"/>
-          <w:i w:val="1"/>
-          <w:iCs w:val="1"/>
-          <w:color w:val="ffffff"/>
-          <w:sz w:val="28"/>
-          <w:szCs w:val="28"/>
-        </w:rPr>
-      </w:pPr>
-      <w:r>
-        <w:rPr>
-          <w:rFonts w:ascii="Montserrat" w:cs="Montserrat" w:eastAsia="Montserrat" w:hAnsi="Montserrat"/>
-          <w:i w:val="1"/>
-          <w:iCs w:val="1"/>
-          <w:color w:val="ffffff"/>
-          <w:sz w:val="28"/>
-          <w:szCs w:val="28"/>
-          <w:rtl w:val="0"/>
-        </w:rPr>
-        <w:t xml:space="preserve">This was the cost of visiting their second home, and she had never dreamed she would risk paying it. Yet, here she was, staring around at a thousand neon stars dancing in the distance. Her tears, floating up to form bubbles and pop into a flicker of sparks, like petals blown in the breeze.</w:t>
+        <w:t xml:space="preserve">The black, she had not seen it for so long, so forbidden as it was to even plant a kiss on the edge of Realm, to dream of it. She had seen men and women alike fried alive, their skin braised to blisters by the continual pouring of ladlefuls of burning-hot pork fat, strapped down on their bellies, their hair sizzling away as their uncanny screams filled the air. </w:t>
+      </w:r>
+    </w:p>
+    <w:p>
+      <w:pPr>
+        <w:rPr>
+          <w:rFonts w:ascii="Montserrat" w:cs="Montserrat" w:eastAsia="Montserrat" w:hAnsi="Montserrat"/>
+          <w:i w:val="1"/>
+          <w:iCs w:val="1"/>
+          <w:color w:val="ffffff"/>
+          <w:sz w:val="28"/>
+          <w:szCs w:val="28"/>
+        </w:rPr>
+      </w:pPr>
+      <w:r>
+        <w:rPr>
+          <w:rFonts w:ascii="Montserrat" w:cs="Montserrat" w:eastAsia="Montserrat" w:hAnsi="Montserrat"/>
+          <w:i w:val="1"/>
+          <w:iCs w:val="1"/>
+          <w:color w:val="ffffff"/>
+          <w:sz w:val="28"/>
+          <w:szCs w:val="28"/>
+          <w:rtl w:val="0"/>
+        </w:rPr>
+        <w:t xml:space="preserve">This was the cost, and she had never dreamed she would risk paying it. Yet, here she was, staring around at a thousand neon stars dancing in the distance. Her tears, floating up to form bubbles and pop into a flicker of sparks, like petals blown in the breeze.</w:t>
       </w:r>
     </w:p>
     <w:p>
@@ -2404,7 +2404,7 @@
           <w:szCs w:val="28"/>
           <w:rtl w:val="0"/>
         </w:rPr>
-        <w:t xml:space="preserve">“It certainly was not,” said Li’an, her ever so slightly wrinkled lips turned downward for a brief second as she lingered on the memories once again. “I’d seen three people subjected to that torture, three in  few short years. It was the most feared punishment, it turned Realm into a waking nightmare for us all.”</w:t>
+        <w:t xml:space="preserve">“It certainly was not,” said Li’an, her ever so slightly wrinkled lips turned downward for a brief second as she lingered on the memories once again. “I’d seen three people subjected to that torture, three in a few short years. It was the most feared punishment, it turned Realm into a waking nightmare for us all.”</w:t>
       </w:r>
     </w:p>
     <w:p>
@@ -2478,9 +2478,234 @@
           <w:szCs w:val="28"/>
           <w:rtl w:val="0"/>
         </w:rPr>
-        <w:t xml:space="preserve">Li’an stepped back, her breaths quickening as a terror rose in her blood, and the quickened beating of her heart released a ripple of mirages into the darkness. She tightened her fists and pulled herself back to the Real, seeing Derrian standing before her, his eyes wide.</w:t>
+        <w:t xml:space="preserve">Li’an stepped back, her breaths quickening as a terror rose in her blood, and the quickened beating of her heart released a ripple of mirages into the darkness. She tightened her fists and pulled herself back to the Real, seeing Derrian standing before her, his eyes wide as he glared at her naked body, her pale skin shaking with fear and the cold of the night.</w:t>
+      </w:r>
+    </w:p>
+    <w:p>
+      <w:pPr>
+        <w:rPr>
+          <w:rFonts w:ascii="Montserrat" w:cs="Montserrat" w:eastAsia="Montserrat" w:hAnsi="Montserrat"/>
+          <w:i w:val="1"/>
+          <w:iCs w:val="1"/>
+          <w:color w:val="ffffff"/>
+          <w:sz w:val="28"/>
+          <w:szCs w:val="28"/>
+        </w:rPr>
+      </w:pPr>
+      <w:r>
+        <w:rPr>
+          <w:rFonts w:ascii="Montserrat" w:cs="Montserrat" w:eastAsia="Montserrat" w:hAnsi="Montserrat"/>
+          <w:i w:val="1"/>
+          <w:iCs w:val="1"/>
+          <w:color w:val="ffffff"/>
+          <w:sz w:val="28"/>
+          <w:szCs w:val="28"/>
+          <w:rtl w:val="0"/>
+        </w:rPr>
+        <w:t xml:space="preserve">She looked deeply into him, and didn’t know whether to run, fight, or fall to the floor and beg for his mercy from all the terror she was owed. </w:t>
+      </w:r>
+    </w:p>
+    <w:p>
+      <w:pPr>
+        <w:rPr>
+          <w:rFonts w:ascii="Montserrat" w:cs="Montserrat" w:eastAsia="Montserrat" w:hAnsi="Montserrat"/>
+          <w:i w:val="1"/>
+          <w:iCs w:val="1"/>
+          <w:color w:val="ffffff"/>
+          <w:sz w:val="28"/>
+          <w:szCs w:val="28"/>
+        </w:rPr>
+      </w:pPr>
+      <w:r>
+        <w:rPr>
+          <w:rtl w:val="0"/>
+        </w:rPr>
+      </w:r>
+    </w:p>
+    <w:p>
+      <w:pPr>
+        <w:rPr>
+          <w:rFonts w:ascii="Montserrat" w:cs="Montserrat" w:eastAsia="Montserrat" w:hAnsi="Montserrat"/>
+          <w:i w:val="1"/>
+          <w:iCs w:val="1"/>
+          <w:color w:val="ffffff"/>
+          <w:sz w:val="28"/>
+          <w:szCs w:val="28"/>
+        </w:rPr>
+      </w:pPr>
+      <w:r>
+        <w:rPr>
+          <w:rFonts w:ascii="Montserrat" w:cs="Montserrat" w:eastAsia="Montserrat" w:hAnsi="Montserrat"/>
+          <w:i w:val="1"/>
+          <w:iCs w:val="1"/>
+          <w:color w:val="ffffff"/>
+          <w:sz w:val="28"/>
+          <w:szCs w:val="28"/>
+          <w:rtl w:val="0"/>
+        </w:rPr>
+        <w:t xml:space="preserve">-</w:t>
+      </w:r>
+    </w:p>
+    <w:p>
+      <w:pPr>
+        <w:rPr>
+          <w:rFonts w:ascii="Montserrat" w:cs="Montserrat" w:eastAsia="Montserrat" w:hAnsi="Montserrat"/>
+          <w:i w:val="1"/>
+          <w:iCs w:val="1"/>
+          <w:color w:val="ffffff"/>
+          <w:sz w:val="28"/>
+          <w:szCs w:val="28"/>
+        </w:rPr>
+      </w:pPr>
+      <w:r>
+        <w:rPr>
+          <w:rtl w:val="0"/>
+        </w:rPr>
+      </w:r>
+    </w:p>
+    <w:p>
+      <w:pPr>
+        <w:rPr>
+          <w:rFonts w:ascii="Montserrat" w:cs="Montserrat" w:eastAsia="Montserrat" w:hAnsi="Montserrat"/>
+          <w:color w:val="ffffff"/>
+          <w:sz w:val="28"/>
+          <w:szCs w:val="28"/>
+        </w:rPr>
+      </w:pPr>
+      <w:r>
+        <w:rPr>
+          <w:rFonts w:ascii="Montserrat" w:cs="Montserrat" w:eastAsia="Montserrat" w:hAnsi="Montserrat"/>
+          <w:i w:val="1"/>
+          <w:iCs w:val="1"/>
+          <w:color w:val="ffffff"/>
+          <w:sz w:val="28"/>
+          <w:szCs w:val="28"/>
+          <w:rtl w:val="0"/>
+        </w:rPr>
+        <w:tab/>
+      </w:r>
+      <w:r>
+        <w:rPr>
+          <w:rFonts w:ascii="Montserrat" w:cs="Montserrat" w:eastAsia="Montserrat" w:hAnsi="Montserrat"/>
+          <w:color w:val="ffffff"/>
+          <w:sz w:val="28"/>
+          <w:szCs w:val="28"/>
+          <w:rtl w:val="0"/>
+        </w:rPr>
+        <w:t xml:space="preserve">“Why… were you nude?” asked Verity, as curious as she was cautious. “Did I miss something?”</w:t>
         <w:br w:type="textWrapping"/>
-        <w:t xml:space="preserve">She looked deeply into him, and didn’t know whether to run, fight, or beg for his mercy. </w:t>
+        <w:tab/>
+        <w:t xml:space="preserve">“Well, the clothes provided to us were not PQ processed, so phasing left them behind,” explained Li’an, and Pristenne’s expression became shy. “The clothes I am wearing now would, of course, come with me wherever I go, all my possessions are processed, their material structure is spaced like mine.”</w:t>
+        <w:br w:type="textWrapping"/>
+        <w:tab/>
+        <w:t xml:space="preserve">“Yes, I…” she said, covering her blushing smile with her hand, the pen grazing her lip. “That makes sense, now, sorry.”</w:t>
+        <w:br w:type="textWrapping"/>
+        <w:tab/>
+        <w:t xml:space="preserve">“Please, don’t be embarrassed, it’s quite the far-removed culture,” she assured her host. “But, yes, it was also a convenient way to catch us, so to be seen </w:t>
+      </w:r>
+      <w:r>
+        <w:rPr>
+          <w:rFonts w:ascii="Montserrat" w:cs="Montserrat" w:eastAsia="Montserrat" w:hAnsi="Montserrat"/>
+          <w:i w:val="1"/>
+          <w:iCs w:val="1"/>
+          <w:color w:val="ffffff"/>
+          <w:sz w:val="28"/>
+          <w:szCs w:val="28"/>
+          <w:rtl w:val="0"/>
+        </w:rPr>
+        <w:t xml:space="preserve">fully </w:t>
+      </w:r>
+      <w:r>
+        <w:rPr>
+          <w:rFonts w:ascii="Montserrat" w:cs="Montserrat" w:eastAsia="Montserrat" w:hAnsi="Montserrat"/>
+          <w:color w:val="ffffff"/>
+          <w:sz w:val="28"/>
+          <w:szCs w:val="28"/>
+          <w:rtl w:val="0"/>
+        </w:rPr>
+        <w:t xml:space="preserve">naked was a grave risk.”</w:t>
+      </w:r>
+    </w:p>
+    <w:p>
+      <w:pPr>
+        <w:rPr>
+          <w:rFonts w:ascii="Montserrat" w:cs="Montserrat" w:eastAsia="Montserrat" w:hAnsi="Montserrat"/>
+          <w:color w:val="ffffff"/>
+          <w:sz w:val="28"/>
+          <w:szCs w:val="28"/>
+        </w:rPr>
+      </w:pPr>
+      <w:r>
+        <w:rPr>
+          <w:rFonts w:ascii="Montserrat" w:cs="Montserrat" w:eastAsia="Montserrat" w:hAnsi="Montserrat"/>
+          <w:color w:val="ffffff"/>
+          <w:sz w:val="28"/>
+          <w:szCs w:val="28"/>
+          <w:rtl w:val="0"/>
+        </w:rPr>
+        <w:tab/>
+        <w:t xml:space="preserve">“So this would have been the most vulnerable you’d ever felt in your life?”</w:t>
+        <w:br w:type="textWrapping"/>
+        <w:tab/>
+        <w:t xml:space="preserve">“Oh, doubtlessly,” she breathed. “Right then, I looked at Derrian and saw little more than hell itself, I couldn’t help but see him in my mind’s eye, standing over me, melting me away… but, that was not my fate, not in his eyes.”</w:t>
+      </w:r>
+    </w:p>
+    <w:p>
+      <w:pPr>
+        <w:rPr>
+          <w:rFonts w:ascii="Montserrat" w:cs="Montserrat" w:eastAsia="Montserrat" w:hAnsi="Montserrat"/>
+          <w:i w:val="1"/>
+          <w:iCs w:val="1"/>
+          <w:color w:val="ffffff"/>
+          <w:sz w:val="28"/>
+          <w:szCs w:val="28"/>
+        </w:rPr>
+      </w:pPr>
+      <w:r>
+        <w:rPr>
+          <w:rtl w:val="0"/>
+        </w:rPr>
+      </w:r>
+    </w:p>
+    <w:p>
+      <w:pPr>
+        <w:rPr>
+          <w:rFonts w:ascii="Montserrat" w:cs="Montserrat" w:eastAsia="Montserrat" w:hAnsi="Montserrat"/>
+          <w:i w:val="1"/>
+          <w:iCs w:val="1"/>
+          <w:color w:val="ffffff"/>
+          <w:sz w:val="28"/>
+          <w:szCs w:val="28"/>
+        </w:rPr>
+      </w:pPr>
+      <w:r>
+        <w:rPr>
+          <w:rFonts w:ascii="Montserrat" w:cs="Montserrat" w:eastAsia="Montserrat" w:hAnsi="Montserrat"/>
+          <w:i w:val="1"/>
+          <w:iCs w:val="1"/>
+          <w:color w:val="ffffff"/>
+          <w:sz w:val="28"/>
+          <w:szCs w:val="28"/>
+          <w:rtl w:val="0"/>
+        </w:rPr>
+        <w:t xml:space="preserve">-</w:t>
+      </w:r>
+    </w:p>
+    <w:p>
+      <w:pPr>
+        <w:rPr>
+          <w:rFonts w:ascii="Montserrat" w:cs="Montserrat" w:eastAsia="Montserrat" w:hAnsi="Montserrat"/>
+          <w:i w:val="1"/>
+          <w:iCs w:val="1"/>
+          <w:color w:val="ffffff"/>
+          <w:sz w:val="28"/>
+          <w:szCs w:val="28"/>
+        </w:rPr>
+      </w:pPr>
+      <w:r>
+        <w:rPr>
+          <w:rtl w:val="0"/>
+        </w:rPr>
       </w:r>
     </w:p>
     <w:p>
@@ -2507,31 +2732,7 @@
         </w:rPr>
         <w:t xml:space="preserve">“It’s alright…” he whispered, almost as if he could hear that horrifying train of thought rolling around her head. “I shouldn’t have touched you like that, I’m sorry. I don’t know how to… I want to help you, I just don’t know what to do.”</w:t>
         <w:br w:type="textWrapping"/>
-        <w:t xml:space="preserve">She stood, glaring at him, then without control she burst into a cascade of tears, throwing herself into his arms. He embraced her, holding the back of her head tightly against his chest.</w:t>
-      </w:r>
-    </w:p>
-    <w:p>
-      <w:pPr>
-        <w:rPr>
-          <w:rFonts w:ascii="Montserrat" w:cs="Montserrat" w:eastAsia="Montserrat" w:hAnsi="Montserrat"/>
-          <w:i w:val="1"/>
-          <w:iCs w:val="1"/>
-          <w:color w:val="ffffff"/>
-          <w:sz w:val="28"/>
-          <w:szCs w:val="28"/>
-        </w:rPr>
-      </w:pPr>
-      <w:r>
-        <w:rPr>
-          <w:rFonts w:ascii="Montserrat" w:cs="Montserrat" w:eastAsia="Montserrat" w:hAnsi="Montserrat"/>
-          <w:i w:val="1"/>
-          <w:iCs w:val="1"/>
-          <w:color w:val="ffffff"/>
-          <w:sz w:val="28"/>
-          <w:szCs w:val="28"/>
-          <w:rtl w:val="0"/>
-        </w:rPr>
-        <w:t xml:space="preserve">This was all she had needed.</w:t>
+        <w:t xml:space="preserve">She stood, glaring at him, then without control she burst into a cascade of tears, throwing herself into his arms. He embraced her, holding the back of her head tightly against his chest, and she was warmed.</w:t>
       </w:r>
     </w:p>
     <w:p>
@@ -2594,7 +2795,7 @@
           <w:szCs w:val="28"/>
           <w:rtl w:val="0"/>
         </w:rPr>
-        <w:t xml:space="preserve">“We were never intimate again, after that, not once” said Li’an, placing down the dregs of her tea with a light tap of the glass on wood. “Not that we had much of a chance. Two days later, the Ebbing arrived at the site.”</w:t>
+        <w:t xml:space="preserve">“We were never intimate again, after that, not once,” said Li’an, placing down the dregs of her tea with a light tap of the glass on wood. “Two days later, the Ebbing arrived at the site.”</w:t>
         <w:br w:type="textWrapping"/>
         <w:t xml:space="preserve">Pristenne reseated herself, turning the page of her journal and readying the tip of her pen.</w:t>
       </w:r>
@@ -3183,7 +3384,7 @@
           <w:szCs w:val="28"/>
           <w:rtl w:val="0"/>
         </w:rPr>
-        <w:t xml:space="preserve"> you might know their strength.”</w:t>
+        <w:t xml:space="preserve"> you might know the nature of their so-called strength.”</w:t>
       </w:r>
     </w:p>
     <w:p>
@@ -4219,7 +4420,7 @@
           <w:szCs w:val="28"/>
           <w:rtl w:val="0"/>
         </w:rPr>
-        <w:t xml:space="preserve">Finally, she saw the gate on her horizon, her scarf fallen away, the rings encompassing her Menyantic eyes glowing as her heart raced. Then, she found herself fallen down beneath the points of Ironguard blades as she collapsed to the ground before threshold of the encampment.</w:t>
+        <w:t xml:space="preserve">Finally, she saw the gate on her horizon, her scarf fallen away, the rings encompassing her Menyantic eyes glowing as her heart raced. Then, she found herself fallen down beneath the points of Ironguard blades as she collapsed to the ground before the threshold of the encampment.</w:t>
       </w:r>
     </w:p>
     <w:p>
@@ -5389,7 +5590,7 @@
           <w:szCs w:val="28"/>
           <w:rtl w:val="0"/>
         </w:rPr>
-        <w:t xml:space="preserve">“Never,” she replied. “I was given a house in Astrum, an honorary citizenship, but it was all very political, all to appease Menastis and the fragile peace. I stayed in the city because it was expected of me, used the gifts to start the Healing Heart support network of which you are, of course, a patron, and… here we are today.” </w:t>
+        <w:t xml:space="preserve">“Never,” she replied. “I was given a house in Astrum, an honorary citizenship, but it was all very political, all to appease Menastis and the fragile peace. I stayed in the city because it was expected of me, used the Crown’s gifts to start the Healing Heart support network of which you are, of course, a patron, and… here we are today.” </w:t>
       </w:r>
     </w:p>
     <w:p>

</xml_diff>

<commit_message>
a few more additions
</commit_message>
<xml_diff>
--- a/chapters/extras/The Modern Histories - Ebbing South.docx
+++ b/chapters/extras/The Modern Histories - Ebbing South.docx
@@ -5118,7 +5118,7 @@
           <w:szCs w:val="28"/>
           <w:rtl w:val="0"/>
         </w:rPr>
-        <w:t xml:space="preserve">“You captured her…?” said Li’an, looking up into Avery’s widening pupils as he turned the key in the lock of the neighbouring cell. “Their leader?”</w:t>
+        <w:t xml:space="preserve">“You captured her…?” said Li’an, looking up into Avery’s widening pupils as he turned the key in the lock of the neighbouring cell. “Their leader? That madwoman?”</w:t>
       </w:r>
     </w:p>
     <w:p>
@@ -5218,57 +5218,57 @@
           <w:szCs w:val="28"/>
           <w:rtl w:val="0"/>
         </w:rPr>
-        <w:t xml:space="preserve">“Do you know this woman?” asked Avery, kneeling down to stare into her.</w:t>
-      </w:r>
-    </w:p>
-    <w:p>
-      <w:pPr>
-        <w:ind w:left="0" w:firstLine="720"/>
-        <w:rPr>
-          <w:rFonts w:ascii="Montserrat" w:cs="Montserrat" w:eastAsia="Montserrat" w:hAnsi="Montserrat"/>
-          <w:i w:val="1"/>
-          <w:iCs w:val="1"/>
-          <w:color w:val="ffffff"/>
-          <w:sz w:val="28"/>
-          <w:szCs w:val="28"/>
-        </w:rPr>
-      </w:pPr>
-      <w:r>
-        <w:rPr>
-          <w:rFonts w:ascii="Montserrat" w:cs="Montserrat" w:eastAsia="Montserrat" w:hAnsi="Montserrat"/>
-          <w:i w:val="1"/>
-          <w:iCs w:val="1"/>
-          <w:color w:val="ffffff"/>
-          <w:sz w:val="28"/>
-          <w:szCs w:val="28"/>
-          <w:rtl w:val="0"/>
-        </w:rPr>
-        <w:t xml:space="preserve">“Oh, I do…” said Mekhis, paying him no mind as she looked at the dirty dress and oil-soaked hair of this once beautiful young lady. “Looks like you picked wrong, huh.”</w:t>
-      </w:r>
-    </w:p>
-    <w:p>
-      <w:pPr>
-        <w:ind w:left="0" w:firstLine="720"/>
-        <w:rPr>
-          <w:rFonts w:ascii="Montserrat" w:cs="Montserrat" w:eastAsia="Montserrat" w:hAnsi="Montserrat"/>
-          <w:i w:val="1"/>
-          <w:iCs w:val="1"/>
-          <w:color w:val="ffffff"/>
-          <w:sz w:val="28"/>
-          <w:szCs w:val="28"/>
-        </w:rPr>
-      </w:pPr>
-      <w:r>
-        <w:rPr>
-          <w:rFonts w:ascii="Montserrat" w:cs="Montserrat" w:eastAsia="Montserrat" w:hAnsi="Montserrat"/>
-          <w:i w:val="1"/>
-          <w:iCs w:val="1"/>
-          <w:color w:val="ffffff"/>
-          <w:sz w:val="28"/>
-          <w:szCs w:val="28"/>
-          <w:rtl w:val="0"/>
-        </w:rPr>
-        <w:t xml:space="preserve">“Tell me of the first time you met, please,” Avery requested, and finally, Mekhis lolled her head towards him, the hair sliced roughly from it, her long plait discarded in the incinerator. </w:t>
+        <w:t xml:space="preserve">“Do you know this woman?” asked Avery, kneeling down to address her.</w:t>
+      </w:r>
+    </w:p>
+    <w:p>
+      <w:pPr>
+        <w:ind w:left="0" w:firstLine="720"/>
+        <w:rPr>
+          <w:rFonts w:ascii="Montserrat" w:cs="Montserrat" w:eastAsia="Montserrat" w:hAnsi="Montserrat"/>
+          <w:i w:val="1"/>
+          <w:iCs w:val="1"/>
+          <w:color w:val="ffffff"/>
+          <w:sz w:val="28"/>
+          <w:szCs w:val="28"/>
+        </w:rPr>
+      </w:pPr>
+      <w:r>
+        <w:rPr>
+          <w:rFonts w:ascii="Montserrat" w:cs="Montserrat" w:eastAsia="Montserrat" w:hAnsi="Montserrat"/>
+          <w:i w:val="1"/>
+          <w:iCs w:val="1"/>
+          <w:color w:val="ffffff"/>
+          <w:sz w:val="28"/>
+          <w:szCs w:val="28"/>
+          <w:rtl w:val="0"/>
+        </w:rPr>
+        <w:t xml:space="preserve">“Oh, I do…” said Mekhis, paying him no mind as she looked at the dirty dress, bruised wrists, and oil-soaked hair of this once beautiful young lady. “Looks like you picked the wrong team, huh. They’ll never accept you.”</w:t>
+      </w:r>
+    </w:p>
+    <w:p>
+      <w:pPr>
+        <w:ind w:left="0" w:firstLine="720"/>
+        <w:rPr>
+          <w:rFonts w:ascii="Montserrat" w:cs="Montserrat" w:eastAsia="Montserrat" w:hAnsi="Montserrat"/>
+          <w:i w:val="1"/>
+          <w:iCs w:val="1"/>
+          <w:color w:val="ffffff"/>
+          <w:sz w:val="28"/>
+          <w:szCs w:val="28"/>
+        </w:rPr>
+      </w:pPr>
+      <w:r>
+        <w:rPr>
+          <w:rFonts w:ascii="Montserrat" w:cs="Montserrat" w:eastAsia="Montserrat" w:hAnsi="Montserrat"/>
+          <w:i w:val="1"/>
+          <w:iCs w:val="1"/>
+          <w:color w:val="ffffff"/>
+          <w:sz w:val="28"/>
+          <w:szCs w:val="28"/>
+          <w:rtl w:val="0"/>
+        </w:rPr>
+        <w:t xml:space="preserve">“Tell me of the first time you met, please,” Avery requested, and finally, Mekhis peeled her gaze from Li’an and lolled her head towards him, the hair sliced roughly from it, her long plait discarded in the incinerator. </w:t>
       </w:r>
     </w:p>
     <w:p>
@@ -5345,57 +5345,57 @@
           <w:szCs w:val="28"/>
           <w:rtl w:val="0"/>
         </w:rPr>
-        <w:t xml:space="preserve">“Oh, whatever his former slaves fancied doing to him,” she said, baring those teeth again in her amusement. “I’ve seen one of them shove a white-hot poker right up a guy’s ass. You gotta give the victims something that really helps ‘em sleep at night, after all.”</w:t>
-      </w:r>
-    </w:p>
-    <w:p>
-      <w:pPr>
-        <w:ind w:left="0" w:firstLine="720"/>
-        <w:rPr>
-          <w:rFonts w:ascii="Montserrat" w:cs="Montserrat" w:eastAsia="Montserrat" w:hAnsi="Montserrat"/>
-          <w:i w:val="1"/>
-          <w:iCs w:val="1"/>
-          <w:color w:val="ffffff"/>
-          <w:sz w:val="28"/>
-          <w:szCs w:val="28"/>
-        </w:rPr>
-      </w:pPr>
-      <w:r>
-        <w:rPr>
-          <w:rFonts w:ascii="Montserrat" w:cs="Montserrat" w:eastAsia="Montserrat" w:hAnsi="Montserrat"/>
-          <w:i w:val="1"/>
-          <w:iCs w:val="1"/>
-          <w:color w:val="ffffff"/>
-          <w:sz w:val="28"/>
-          <w:szCs w:val="28"/>
-          <w:rtl w:val="0"/>
-        </w:rPr>
-        <w:t xml:space="preserve">“And in Ferrier, you murdered this man, Derrian, despite him having taken care of one of your own?”</w:t>
-      </w:r>
-    </w:p>
-    <w:p>
-      <w:pPr>
-        <w:ind w:left="0" w:firstLine="720"/>
-        <w:rPr>
-          <w:rFonts w:ascii="Montserrat" w:cs="Montserrat" w:eastAsia="Montserrat" w:hAnsi="Montserrat"/>
-          <w:i w:val="1"/>
-          <w:iCs w:val="1"/>
-          <w:color w:val="ffffff"/>
-          <w:sz w:val="28"/>
-          <w:szCs w:val="28"/>
-        </w:rPr>
-      </w:pPr>
-      <w:r>
-        <w:rPr>
-          <w:rFonts w:ascii="Montserrat" w:cs="Montserrat" w:eastAsia="Montserrat" w:hAnsi="Montserrat"/>
-          <w:i w:val="1"/>
-          <w:iCs w:val="1"/>
-          <w:color w:val="ffffff"/>
-          <w:sz w:val="28"/>
-          <w:szCs w:val="28"/>
-          <w:rtl w:val="0"/>
-        </w:rPr>
-        <w:t xml:space="preserve">“He was doing the same thing as he’d always done,” she said, slowly. “Serving the Gods-damned Devils. So was she.”</w:t>
+        <w:t xml:space="preserve">“Oh, whatever his former slaves fancied doing to him,” she said, baring those teeth again in her amusement. “I’ve seen one of these girls shove a white-hot poker right up a guy’s ass. You gotta give the victims something that really helps ‘em sleep at night, don’t ya.”</w:t>
+      </w:r>
+    </w:p>
+    <w:p>
+      <w:pPr>
+        <w:ind w:left="0" w:firstLine="720"/>
+        <w:rPr>
+          <w:rFonts w:ascii="Montserrat" w:cs="Montserrat" w:eastAsia="Montserrat" w:hAnsi="Montserrat"/>
+          <w:i w:val="1"/>
+          <w:iCs w:val="1"/>
+          <w:color w:val="ffffff"/>
+          <w:sz w:val="28"/>
+          <w:szCs w:val="28"/>
+        </w:rPr>
+      </w:pPr>
+      <w:r>
+        <w:rPr>
+          <w:rFonts w:ascii="Montserrat" w:cs="Montserrat" w:eastAsia="Montserrat" w:hAnsi="Montserrat"/>
+          <w:i w:val="1"/>
+          <w:iCs w:val="1"/>
+          <w:color w:val="ffffff"/>
+          <w:sz w:val="28"/>
+          <w:szCs w:val="28"/>
+          <w:rtl w:val="0"/>
+        </w:rPr>
+        <w:t xml:space="preserve">“And in Ferrier, you murdered said man, despite him having taken care of one of your own?”</w:t>
+      </w:r>
+    </w:p>
+    <w:p>
+      <w:pPr>
+        <w:ind w:left="0" w:firstLine="720"/>
+        <w:rPr>
+          <w:rFonts w:ascii="Montserrat" w:cs="Montserrat" w:eastAsia="Montserrat" w:hAnsi="Montserrat"/>
+          <w:i w:val="1"/>
+          <w:iCs w:val="1"/>
+          <w:color w:val="ffffff"/>
+          <w:sz w:val="28"/>
+          <w:szCs w:val="28"/>
+        </w:rPr>
+      </w:pPr>
+      <w:r>
+        <w:rPr>
+          <w:rFonts w:ascii="Montserrat" w:cs="Montserrat" w:eastAsia="Montserrat" w:hAnsi="Montserrat"/>
+          <w:i w:val="1"/>
+          <w:iCs w:val="1"/>
+          <w:color w:val="ffffff"/>
+          <w:sz w:val="28"/>
+          <w:szCs w:val="28"/>
+          <w:rtl w:val="0"/>
+        </w:rPr>
+        <w:t xml:space="preserve">“He was doing the same thing as he’d always done,” she said, slowly. “Serving the Gods-damned devils. Looks like she was, too. I should have bled her, fucking traitor.”</w:t>
       </w:r>
     </w:p>
     <w:p>
@@ -5420,7 +5420,7 @@
           <w:szCs w:val="28"/>
           <w:rtl w:val="0"/>
         </w:rPr>
-        <w:t xml:space="preserve">He rose to his feet and brushed off his hands.</w:t>
+        <w:t xml:space="preserve">He rose to his feet and brushed off his hands, and Mekhis did not break from pointing her broken face up at him.</w:t>
       </w:r>
     </w:p>
     <w:p>
@@ -5527,28 +5527,28 @@
           <w:szCs w:val="28"/>
           <w:rtl w:val="0"/>
         </w:rPr>
-        <w:t xml:space="preserve">“Wait, so, if she’d have lied, you’d be dead right now?”</w:t>
-      </w:r>
-    </w:p>
-    <w:p>
-      <w:pPr>
-        <w:ind w:left="0" w:firstLine="720"/>
-        <w:rPr>
-          <w:rFonts w:ascii="Montserrat" w:cs="Montserrat" w:eastAsia="Montserrat" w:hAnsi="Montserrat"/>
-          <w:color w:val="ffffff"/>
-          <w:sz w:val="28"/>
-          <w:szCs w:val="28"/>
-        </w:rPr>
-      </w:pPr>
-      <w:r>
-        <w:rPr>
-          <w:rFonts w:ascii="Montserrat" w:cs="Montserrat" w:eastAsia="Montserrat" w:hAnsi="Montserrat"/>
-          <w:color w:val="ffffff"/>
-          <w:sz w:val="28"/>
-          <w:szCs w:val="28"/>
-          <w:rtl w:val="0"/>
-        </w:rPr>
-        <w:t xml:space="preserve">“There’s little doubt about it,” said Li’an, a sorrowful smile on her lips. “But, Avery presented a case to King Lor’End on my behalf, and two days later, I was dressed like a queen, receiving an award for bravery in the Crown Hall. I was showered with gifts and gold, everyone was calling me a hero. I didn’t even know what to say to anyone.”</w:t>
+        <w:t xml:space="preserve">“Wait, so, if she’d said anything else, implicated you somehow, you’d be dead right now?”</w:t>
+      </w:r>
+    </w:p>
+    <w:p>
+      <w:pPr>
+        <w:ind w:left="0" w:firstLine="720"/>
+        <w:rPr>
+          <w:rFonts w:ascii="Montserrat" w:cs="Montserrat" w:eastAsia="Montserrat" w:hAnsi="Montserrat"/>
+          <w:color w:val="ffffff"/>
+          <w:sz w:val="28"/>
+          <w:szCs w:val="28"/>
+        </w:rPr>
+      </w:pPr>
+      <w:r>
+        <w:rPr>
+          <w:rFonts w:ascii="Montserrat" w:cs="Montserrat" w:eastAsia="Montserrat" w:hAnsi="Montserrat"/>
+          <w:color w:val="ffffff"/>
+          <w:sz w:val="28"/>
+          <w:szCs w:val="28"/>
+          <w:rtl w:val="0"/>
+        </w:rPr>
+        <w:t xml:space="preserve">“There’s little doubt about it,” said Li’an, a sorrowful smile on her lips. “I suspected she had been purposefully cruel, exaggerated her loathing, but I’ll never truly know. She had every reason to despise me.” Li’an took a deep breath, and her eyelashes fluttered with each passing thread of thought. “With the help of my father, Avery presented my case to King Lor’End, and two days later, I was dressed like a queen, receiving an award for bravery in the Crown Hall. I was showered with gifts and gold, everyone was calling me a hero. I didn’t even know what to say to anyone, it was all such a shift.”</w:t>
       </w:r>
     </w:p>
     <w:p>
@@ -5653,7 +5653,7 @@
           <w:szCs w:val="28"/>
           <w:rtl w:val="0"/>
         </w:rPr>
-        <w:t xml:space="preserve">“Every day,” she said. “But I know I’ll see him again, when my life here comes to its end.”</w:t>
+        <w:t xml:space="preserve">“Balo is the other half of my soul, and I miss him every day,” she said. “But I know I’ll see him again, when my life here comes to its end.”</w:t>
       </w:r>
     </w:p>
     <w:p>
@@ -5695,7 +5695,7 @@
           <w:szCs w:val="28"/>
           <w:rtl w:val="0"/>
         </w:rPr>
-        <w:t xml:space="preserve">“Hmm…” she looked down at the tiles. “In a different way, of course. And I’ll see </w:t>
+        <w:t xml:space="preserve">“Hmm…” she looked down at the tiles. “In a different way, of course. He never had cause to be so kind to me as he was, and such a thing is unforgettable. I’ll see </w:t>
       </w:r>
       <w:r>
         <w:rPr>
@@ -5717,7 +5717,7 @@
           <w:szCs w:val="28"/>
           <w:rtl w:val="0"/>
         </w:rPr>
-        <w:t xml:space="preserve">again, too.”</w:t>
+        <w:t xml:space="preserve">again, too, I suspect.”</w:t>
       </w:r>
     </w:p>
     <w:p>
@@ -5739,28 +5739,50 @@
           <w:rtl w:val="0"/>
         </w:rPr>
         <w:tab/>
-        <w:t xml:space="preserve">“One last question,” said Verity, watching her assistant shuffle away and begin to pack her things on the table at the back of the room. “The wealth you’ve amassed today, does it in any way compensate for everything that happened to you? Will any material amount ever be enough?”</w:t>
-      </w:r>
-    </w:p>
-    <w:p>
-      <w:pPr>
-        <w:ind w:left="0" w:firstLine="720"/>
-        <w:rPr>
-          <w:rFonts w:ascii="Montserrat" w:cs="Montserrat" w:eastAsia="Montserrat" w:hAnsi="Montserrat"/>
-          <w:color w:val="ffffff"/>
-          <w:sz w:val="28"/>
-          <w:szCs w:val="28"/>
-        </w:rPr>
-      </w:pPr>
-      <w:r>
-        <w:rPr>
-          <w:rFonts w:ascii="Montserrat" w:cs="Montserrat" w:eastAsia="Montserrat" w:hAnsi="Montserrat"/>
-          <w:color w:val="ffffff"/>
-          <w:sz w:val="28"/>
-          <w:szCs w:val="28"/>
-          <w:rtl w:val="0"/>
-        </w:rPr>
-        <w:t xml:space="preserve">“You know, I always thought that King Lor’End might have still suspected me a spy all those years, and all the wealth was just trying to keep me close, under the Crown’s eye. He was a wise and cautious king, after all, and it served me well to </w:t>
+        <w:t xml:space="preserve">“That will be an interesting eternity…” said Verity, watching her assistant shuffle away and begin to pack her things on the table at the back of the room. “One last question, if you can. The wealth you’ve amassed today, does it in any way compensate for everything that happened to you? Will any material amount ever be enough?”</w:t>
+      </w:r>
+    </w:p>
+    <w:p>
+      <w:pPr>
+        <w:ind w:left="0" w:firstLine="720"/>
+        <w:rPr>
+          <w:rFonts w:ascii="Montserrat" w:cs="Montserrat" w:eastAsia="Montserrat" w:hAnsi="Montserrat"/>
+          <w:color w:val="ffffff"/>
+          <w:sz w:val="28"/>
+          <w:szCs w:val="28"/>
+        </w:rPr>
+      </w:pPr>
+      <w:r>
+        <w:rPr>
+          <w:rFonts w:ascii="Montserrat" w:cs="Montserrat" w:eastAsia="Montserrat" w:hAnsi="Montserrat"/>
+          <w:color w:val="ffffff"/>
+          <w:sz w:val="28"/>
+          <w:szCs w:val="28"/>
+          <w:rtl w:val="0"/>
+        </w:rPr>
+        <w:t xml:space="preserve">“Just to be </w:t>
+      </w:r>
+      <w:r>
+        <w:rPr>
+          <w:rFonts w:ascii="Montserrat" w:cs="Montserrat" w:eastAsia="Montserrat" w:hAnsi="Montserrat"/>
+          <w:i w:val="1"/>
+          <w:iCs w:val="1"/>
+          <w:color w:val="ffffff"/>
+          <w:sz w:val="28"/>
+          <w:szCs w:val="28"/>
+          <w:rtl w:val="0"/>
+        </w:rPr>
+        <w:t xml:space="preserve">recognised </w:t>
+      </w:r>
+      <w:r>
+        <w:rPr>
+          <w:rFonts w:ascii="Montserrat" w:cs="Montserrat" w:eastAsia="Montserrat" w:hAnsi="Montserrat"/>
+          <w:color w:val="ffffff"/>
+          <w:sz w:val="28"/>
+          <w:szCs w:val="28"/>
+          <w:rtl w:val="0"/>
+        </w:rPr>
+        <w:t xml:space="preserve">as an objector to the Ebbing would have been enough for me,” she sighed. “But you know, I always thought that King Lor’End might have still suspected me a spy all those years, and all the wealth was just trying to keep me close, under the Crown’s eye. He was a wise and cautious king, after all, and it served me well to </w:t>
       </w:r>
       <w:r>
         <w:rPr>

</xml_diff>